<commit_message>
final build before deployment
</commit_message>
<xml_diff>
--- a/kb/docs/scope.docx
+++ b/kb/docs/scope.docx
@@ -11,7 +11,6 @@
           <w:b/>
           <w:bCs/>
           <w:caps/>
-          <w:color w:val="1F3864"/>
           <w:spacing w:val="40"/>
           <w:sz w:val="18"/>
           <w:szCs w:val="18"/>
@@ -27,16 +26,12 @@
         <w:rPr>
           <w:i/>
           <w:iCs/>
-          <w:color w:val="595959"/>
         </w:rPr>
         <w:t>Department of Computer Science</w:t>
       </w:r>
     </w:p>
     <w:p>
       <w:pPr>
-        <w:pBdr>
-          <w:bottom w:val="single" w:sz="12" w:space="0" w:color="1F3864"/>
-        </w:pBdr>
         <w:spacing w:before="40" w:after="200"/>
       </w:pPr>
     </w:p>
@@ -48,7 +43,6 @@
         <w:rPr>
           <w:b/>
           <w:bCs/>
-          <w:color w:val="1F3864"/>
           <w:sz w:val="32"/>
           <w:szCs w:val="32"/>
         </w:rPr>
@@ -63,7 +57,6 @@
         <w:rPr>
           <w:i/>
           <w:iCs/>
-          <w:color w:val="595959"/>
         </w:rPr>
         <w:t>AI-Powered Student Support Chatbot — CSC302 — South-East University</w:t>
       </w:r>
@@ -73,30 +66,17 @@
         <w:spacing w:after="160"/>
       </w:pPr>
       <w:r>
-        <w:rPr>
-          <w:color w:val="2E2E2E"/>
-        </w:rPr>
-        <w:t>This document defines the scope of the chatbot artefact built as part of the dissertation: Design and Evaluation of an AI-Powered Student Support Chatbot Using Large Language Models and Retrieval-Augmented Generation. It records the decisions made about wh</w:t>
-      </w:r>
-      <w:r>
-        <w:rPr>
-          <w:color w:val="2E2E2E"/>
-        </w:rPr>
-        <w:t>at the system will and will not do, which institution and module it is built around, and what documents form its Knowledge Base.</w:t>
-      </w:r>
-    </w:p>
-    <w:p>
-      <w:pPr>
-        <w:pBdr>
-          <w:bottom w:val="single" w:sz="6" w:space="0" w:color="1F3864"/>
-        </w:pBdr>
+        <w:t>This document defines the scope of the chatbot artefact built as part of the dissertation: Design and Evaluation of an AI-Powered Student Support Chatbot Using Large Language Models and Retrieval-Augmented Generation. It records the decisions made about what the system will and will not do, which institution and module it is built around, and what documents form its Knowledge Base.</w:t>
+      </w:r>
+    </w:p>
+    <w:p>
+      <w:pPr>
         <w:spacing w:before="400" w:after="120"/>
       </w:pPr>
       <w:r>
         <w:rPr>
           <w:b/>
           <w:bCs/>
-          <w:color w:val="1F3864"/>
           <w:sz w:val="32"/>
           <w:szCs w:val="32"/>
         </w:rPr>
@@ -125,12 +105,6 @@
         <w:gridCol w:w="6360"/>
       </w:tblGrid>
       <w:tr>
-        <w:tblPrEx>
-          <w:tblCellMar>
-            <w:top w:w="0" w:type="dxa"/>
-            <w:bottom w:w="0" w:type="dxa"/>
-          </w:tblCellMar>
-        </w:tblPrEx>
         <w:trPr>
           <w:tblHeader/>
         </w:trPr>
@@ -156,7 +130,6 @@
               <w:rPr>
                 <w:b/>
                 <w:bCs/>
-                <w:color w:val="FFFFFF"/>
                 <w:sz w:val="20"/>
                 <w:szCs w:val="20"/>
               </w:rPr>
@@ -186,7 +159,6 @@
               <w:rPr>
                 <w:b/>
                 <w:bCs/>
-                <w:color w:val="FFFFFF"/>
                 <w:sz w:val="20"/>
                 <w:szCs w:val="20"/>
               </w:rPr>
@@ -196,12 +168,6 @@
         </w:tc>
       </w:tr>
       <w:tr>
-        <w:tblPrEx>
-          <w:tblCellMar>
-            <w:top w:w="0" w:type="dxa"/>
-            <w:bottom w:w="0" w:type="dxa"/>
-          </w:tblCellMar>
-        </w:tblPrEx>
         <w:tc>
           <w:tcPr>
             <w:tcW w:w="3000" w:type="dxa"/>
@@ -222,7 +188,6 @@
           <w:p>
             <w:r>
               <w:rPr>
-                <w:color w:val="2E2E2E"/>
                 <w:sz w:val="20"/>
                 <w:szCs w:val="20"/>
               </w:rPr>
@@ -250,7 +215,6 @@
           <w:p>
             <w:r>
               <w:rPr>
-                <w:color w:val="2E2E2E"/>
                 <w:sz w:val="20"/>
                 <w:szCs w:val="20"/>
               </w:rPr>
@@ -260,12 +224,6 @@
         </w:tc>
       </w:tr>
       <w:tr>
-        <w:tblPrEx>
-          <w:tblCellMar>
-            <w:top w:w="0" w:type="dxa"/>
-            <w:bottom w:w="0" w:type="dxa"/>
-          </w:tblCellMar>
-        </w:tblPrEx>
         <w:tc>
           <w:tcPr>
             <w:tcW w:w="3000" w:type="dxa"/>
@@ -286,7 +244,6 @@
           <w:p>
             <w:r>
               <w:rPr>
-                <w:color w:val="2E2E2E"/>
                 <w:sz w:val="20"/>
                 <w:szCs w:val="20"/>
               </w:rPr>
@@ -314,7 +271,6 @@
           <w:p>
             <w:r>
               <w:rPr>
-                <w:color w:val="2E2E2E"/>
                 <w:sz w:val="20"/>
                 <w:szCs w:val="20"/>
               </w:rPr>
@@ -324,12 +280,6 @@
         </w:tc>
       </w:tr>
       <w:tr>
-        <w:tblPrEx>
-          <w:tblCellMar>
-            <w:top w:w="0" w:type="dxa"/>
-            <w:bottom w:w="0" w:type="dxa"/>
-          </w:tblCellMar>
-        </w:tblPrEx>
         <w:tc>
           <w:tcPr>
             <w:tcW w:w="3000" w:type="dxa"/>
@@ -350,7 +300,6 @@
           <w:p>
             <w:r>
               <w:rPr>
-                <w:color w:val="2E2E2E"/>
                 <w:sz w:val="20"/>
                 <w:szCs w:val="20"/>
               </w:rPr>
@@ -378,7 +327,6 @@
           <w:p>
             <w:r>
               <w:rPr>
-                <w:color w:val="2E2E2E"/>
                 <w:sz w:val="20"/>
                 <w:szCs w:val="20"/>
               </w:rPr>
@@ -388,12 +336,6 @@
         </w:tc>
       </w:tr>
       <w:tr>
-        <w:tblPrEx>
-          <w:tblCellMar>
-            <w:top w:w="0" w:type="dxa"/>
-            <w:bottom w:w="0" w:type="dxa"/>
-          </w:tblCellMar>
-        </w:tblPrEx>
         <w:tc>
           <w:tcPr>
             <w:tcW w:w="3000" w:type="dxa"/>
@@ -414,7 +356,6 @@
           <w:p>
             <w:r>
               <w:rPr>
-                <w:color w:val="2E2E2E"/>
                 <w:sz w:val="20"/>
                 <w:szCs w:val="20"/>
               </w:rPr>
@@ -442,7 +383,6 @@
           <w:p>
             <w:r>
               <w:rPr>
-                <w:color w:val="2E2E2E"/>
                 <w:sz w:val="20"/>
                 <w:szCs w:val="20"/>
               </w:rPr>
@@ -452,12 +392,6 @@
         </w:tc>
       </w:tr>
       <w:tr>
-        <w:tblPrEx>
-          <w:tblCellMar>
-            <w:top w:w="0" w:type="dxa"/>
-            <w:bottom w:w="0" w:type="dxa"/>
-          </w:tblCellMar>
-        </w:tblPrEx>
         <w:tc>
           <w:tcPr>
             <w:tcW w:w="3000" w:type="dxa"/>
@@ -478,7 +412,6 @@
           <w:p>
             <w:r>
               <w:rPr>
-                <w:color w:val="2E2E2E"/>
                 <w:sz w:val="20"/>
                 <w:szCs w:val="20"/>
               </w:rPr>
@@ -506,7 +439,6 @@
           <w:p>
             <w:r>
               <w:rPr>
-                <w:color w:val="2E2E2E"/>
                 <w:sz w:val="20"/>
                 <w:szCs w:val="20"/>
               </w:rPr>
@@ -516,12 +448,6 @@
         </w:tc>
       </w:tr>
       <w:tr>
-        <w:tblPrEx>
-          <w:tblCellMar>
-            <w:top w:w="0" w:type="dxa"/>
-            <w:bottom w:w="0" w:type="dxa"/>
-          </w:tblCellMar>
-        </w:tblPrEx>
         <w:tc>
           <w:tcPr>
             <w:tcW w:w="3000" w:type="dxa"/>
@@ -542,19 +468,10 @@
           <w:p>
             <w:r>
               <w:rPr>
-                <w:color w:val="2E2E2E"/>
-                <w:sz w:val="20"/>
-                <w:szCs w:val="20"/>
-              </w:rPr>
-              <w:t>Acade</w:t>
-            </w:r>
-            <w:r>
-              <w:rPr>
-                <w:color w:val="2E2E2E"/>
-                <w:sz w:val="20"/>
-                <w:szCs w:val="20"/>
-              </w:rPr>
-              <w:t>mic Year</w:t>
+                <w:sz w:val="20"/>
+                <w:szCs w:val="20"/>
+              </w:rPr>
+              <w:t>Academic Year</w:t>
             </w:r>
           </w:p>
         </w:tc>
@@ -578,7 +495,6 @@
           <w:p>
             <w:r>
               <w:rPr>
-                <w:color w:val="2E2E2E"/>
                 <w:sz w:val="20"/>
                 <w:szCs w:val="20"/>
               </w:rPr>
@@ -595,16 +511,12 @@
     </w:p>
     <w:p>
       <w:pPr>
-        <w:pBdr>
-          <w:bottom w:val="single" w:sz="6" w:space="0" w:color="1F3864"/>
-        </w:pBdr>
         <w:spacing w:before="400" w:after="120"/>
       </w:pPr>
       <w:r>
         <w:rPr>
           <w:b/>
           <w:bCs/>
-          <w:color w:val="1F3864"/>
           <w:sz w:val="32"/>
           <w:szCs w:val="32"/>
         </w:rPr>
@@ -616,9 +528,6 @@
         <w:spacing w:after="160"/>
       </w:pPr>
       <w:r>
-        <w:rPr>
-          <w:color w:val="2E2E2E"/>
-        </w:rPr>
         <w:t>The chatbot is designed to answer student questions grounded strictly in the eight official CSC302 documents listed in the Knowledge Base register. It will answer questions about:</w:t>
       </w:r>
     </w:p>
@@ -628,16 +537,7 @@
         <w:ind w:left="720" w:hanging="360"/>
       </w:pPr>
       <w:r>
-        <w:rPr>
-          <w:color w:val="1F3864"/>
-        </w:rPr>
-        <w:t xml:space="preserve">•  </w:t>
-      </w:r>
-      <w:r>
-        <w:rPr>
-          <w:color w:val="2E2E2E"/>
-        </w:rPr>
-        <w:t>Assessment deadlines (CW01, CW02, EX01)</w:t>
+        <w:t>•  Assessment deadlines (CW01, CW02, EX01)</w:t>
       </w:r>
     </w:p>
     <w:p>
@@ -646,16 +546,7 @@
         <w:ind w:left="720" w:hanging="360"/>
       </w:pPr>
       <w:r>
-        <w:rPr>
-          <w:color w:val="1F3864"/>
-        </w:rPr>
-        <w:t xml:space="preserve">•  </w:t>
-      </w:r>
-      <w:r>
-        <w:rPr>
-          <w:color w:val="2E2E2E"/>
-        </w:rPr>
-        <w:t>Word limits, file formats, and submission naming conventions</w:t>
+        <w:t>•  Word limits, file formats, and submission naming conventions</w:t>
       </w:r>
     </w:p>
     <w:p>
@@ -664,16 +555,7 @@
         <w:ind w:left="720" w:hanging="360"/>
       </w:pPr>
       <w:r>
-        <w:rPr>
-          <w:color w:val="1F3864"/>
-        </w:rPr>
-        <w:t xml:space="preserve">•  </w:t>
-      </w:r>
-      <w:r>
-        <w:rPr>
-          <w:color w:val="2E2E2E"/>
-        </w:rPr>
-        <w:t>How to submit work via the VLE</w:t>
+        <w:t>•  How to submit work via the VLE</w:t>
       </w:r>
     </w:p>
     <w:p>
@@ -682,16 +564,7 @@
         <w:ind w:left="720" w:hanging="360"/>
       </w:pPr>
       <w:r>
-        <w:rPr>
-          <w:color w:val="1F3864"/>
-        </w:rPr>
-        <w:t xml:space="preserve">•  </w:t>
-      </w:r>
-      <w:r>
-        <w:rPr>
-          <w:color w:val="2E2E2E"/>
-        </w:rPr>
-        <w:t>Late submission penalties</w:t>
+        <w:t>•  Late submission penalties</w:t>
       </w:r>
     </w:p>
     <w:p>
@@ -700,16 +573,7 @@
         <w:ind w:left="720" w:hanging="360"/>
       </w:pPr>
       <w:r>
-        <w:rPr>
-          <w:color w:val="1F3864"/>
-        </w:rPr>
-        <w:t xml:space="preserve">•  </w:t>
-      </w:r>
-      <w:r>
-        <w:rPr>
-          <w:color w:val="2E2E2E"/>
-        </w:rPr>
-        <w:t>The extension request process and what qualifies</w:t>
+        <w:t>•  The extension request process and what qualifies</w:t>
       </w:r>
     </w:p>
     <w:p>
@@ -718,16 +582,7 @@
         <w:ind w:left="720" w:hanging="360"/>
       </w:pPr>
       <w:r>
-        <w:rPr>
-          <w:color w:val="1F3864"/>
-        </w:rPr>
-        <w:t xml:space="preserve">•  </w:t>
-      </w:r>
-      <w:r>
-        <w:rPr>
-          <w:color w:val="2E2E2E"/>
-        </w:rPr>
-        <w:t>Marking criteria and rubric details</w:t>
+        <w:t>•  Marking criteria and rubric details</w:t>
       </w:r>
     </w:p>
     <w:p>
@@ -736,16 +591,7 @@
         <w:ind w:left="720" w:hanging="360"/>
       </w:pPr>
       <w:r>
-        <w:rPr>
-          <w:color w:val="1F3864"/>
-        </w:rPr>
-        <w:t xml:space="preserve">•  </w:t>
-      </w:r>
-      <w:r>
-        <w:rPr>
-          <w:color w:val="2E2E2E"/>
-        </w:rPr>
-        <w:t>Module content and the weekly schedule</w:t>
+        <w:t>•  Module content and the weekly schedule</w:t>
       </w:r>
     </w:p>
     <w:p>
@@ -754,16 +600,7 @@
         <w:ind w:left="720" w:hanging="360"/>
       </w:pPr>
       <w:r>
-        <w:rPr>
-          <w:color w:val="1F3864"/>
-        </w:rPr>
-        <w:t xml:space="preserve">•  </w:t>
-      </w:r>
-      <w:r>
-        <w:rPr>
-          <w:color w:val="2E2E2E"/>
-        </w:rPr>
-        <w:t>Contact details and office hours</w:t>
+        <w:t>•  Contact details and office hours</w:t>
       </w:r>
     </w:p>
     <w:p>
@@ -772,16 +609,7 @@
         <w:ind w:left="720" w:hanging="360"/>
       </w:pPr>
       <w:r>
-        <w:rPr>
-          <w:color w:val="1F3864"/>
-        </w:rPr>
-        <w:t xml:space="preserve">•  </w:t>
-      </w:r>
-      <w:r>
-        <w:rPr>
-          <w:color w:val="2E2E2E"/>
-        </w:rPr>
-        <w:t>Examination format and content coverage</w:t>
+        <w:t>•  Examination format and content coverage</w:t>
       </w:r>
     </w:p>
     <w:p>
@@ -790,16 +618,7 @@
         <w:ind w:left="720" w:hanging="360"/>
       </w:pPr>
       <w:r>
-        <w:rPr>
-          <w:color w:val="1F3864"/>
-        </w:rPr>
-        <w:t xml:space="preserve">•  </w:t>
-      </w:r>
-      <w:r>
-        <w:rPr>
-          <w:color w:val="2E2E2E"/>
-        </w:rPr>
-        <w:t>Group project rules for CW02</w:t>
+        <w:t>•  Group project rules for CW02</w:t>
       </w:r>
     </w:p>
     <w:p>
@@ -808,16 +627,7 @@
         <w:ind w:left="720" w:hanging="360"/>
       </w:pPr>
       <w:r>
-        <w:rPr>
-          <w:color w:val="1F3864"/>
-        </w:rPr>
-        <w:t xml:space="preserve">•  </w:t>
-      </w:r>
-      <w:r>
-        <w:rPr>
-          <w:color w:val="2E2E2E"/>
-        </w:rPr>
-        <w:t>Academic integrity rules and AI tool use policies</w:t>
+        <w:t>•  Academic integrity rules and AI tool use policies</w:t>
       </w:r>
     </w:p>
     <w:p>
@@ -830,7 +640,6 @@
         <w:rPr>
           <w:b/>
           <w:bCs/>
-          <w:color w:val="1F3864"/>
           <w:sz w:val="32"/>
           <w:szCs w:val="32"/>
         </w:rPr>
@@ -839,7 +648,6 @@
         <w:rPr>
           <w:b/>
           <w:bCs/>
-          <w:color w:val="1F3864"/>
           <w:sz w:val="32"/>
           <w:szCs w:val="32"/>
         </w:rPr>
@@ -848,16 +656,12 @@
     </w:p>
     <w:p>
       <w:pPr>
-        <w:pBdr>
-          <w:bottom w:val="single" w:sz="6" w:space="0" w:color="1F3864"/>
-        </w:pBdr>
         <w:spacing w:before="400" w:after="120"/>
       </w:pPr>
       <w:r>
         <w:rPr>
           <w:b/>
           <w:bCs/>
-          <w:color w:val="1F3864"/>
           <w:sz w:val="32"/>
           <w:szCs w:val="32"/>
         </w:rPr>
@@ -870,9 +674,6 @@
         <w:spacing w:after="160"/>
       </w:pPr>
       <w:r>
-        <w:rPr>
-          <w:color w:val="2E2E2E"/>
-        </w:rPr>
         <w:t>The following are explicitly out of scope:</w:t>
       </w:r>
     </w:p>
@@ -882,16 +683,7 @@
         <w:ind w:left="720" w:hanging="360"/>
       </w:pPr>
       <w:r>
-        <w:rPr>
-          <w:color w:val="1F3864"/>
-        </w:rPr>
-        <w:t xml:space="preserve">•  </w:t>
-      </w:r>
-      <w:r>
-        <w:rPr>
-          <w:color w:val="2E2E2E"/>
-        </w:rPr>
-        <w:t>Individual student marks, grades, or attendance records (the system has no access to these)</w:t>
+        <w:t>•  Individual student marks, grades, or attendance records (the system has no access to these)</w:t>
       </w:r>
     </w:p>
     <w:p>
@@ -900,16 +692,7 @@
         <w:ind w:left="720" w:hanging="360"/>
       </w:pPr>
       <w:r>
-        <w:rPr>
-          <w:color w:val="1F3864"/>
-        </w:rPr>
-        <w:t xml:space="preserve">•  </w:t>
-      </w:r>
-      <w:r>
-        <w:rPr>
-          <w:color w:val="2E2E2E"/>
-        </w:rPr>
-        <w:t>Binding decisions on extension eligibility — students are directed to the Student Office</w:t>
+        <w:t>•  Binding decisions on extension eligibility — students are directed to the Student Office</w:t>
       </w:r>
     </w:p>
     <w:p>
@@ -918,22 +701,7 @@
         <w:ind w:left="720" w:hanging="360"/>
       </w:pPr>
       <w:r>
-        <w:rPr>
-          <w:color w:val="1F3864"/>
-        </w:rPr>
-        <w:t xml:space="preserve">•  </w:t>
-      </w:r>
-      <w:r>
-        <w:rPr>
-          <w:color w:val="2E2E2E"/>
-        </w:rPr>
-        <w:t>Legal, medical, or pers</w:t>
-      </w:r>
-      <w:r>
-        <w:rPr>
-          <w:color w:val="2E2E2E"/>
-        </w:rPr>
-        <w:t>onal counselling advice</w:t>
+        <w:t>•  Legal, medical, or personal counselling advice</w:t>
       </w:r>
     </w:p>
     <w:p>
@@ -942,16 +710,7 @@
         <w:ind w:left="720" w:hanging="360"/>
       </w:pPr>
       <w:r>
-        <w:rPr>
-          <w:color w:val="1F3864"/>
-        </w:rPr>
-        <w:t xml:space="preserve">•  </w:t>
-      </w:r>
-      <w:r>
-        <w:rPr>
-          <w:color w:val="2E2E2E"/>
-        </w:rPr>
-        <w:t>Speculation about likely examination questions</w:t>
+        <w:t>•  Speculation about likely examination questions</w:t>
       </w:r>
     </w:p>
     <w:p>
@@ -960,16 +719,7 @@
         <w:ind w:left="720" w:hanging="360"/>
       </w:pPr>
       <w:r>
-        <w:rPr>
-          <w:color w:val="1F3864"/>
-        </w:rPr>
-        <w:t xml:space="preserve">•  </w:t>
-      </w:r>
-      <w:r>
-        <w:rPr>
-          <w:color w:val="2E2E2E"/>
-        </w:rPr>
-        <w:t>Anything not addressed in the KB documents</w:t>
+        <w:t>•  Anything not addressed in the KB documents</w:t>
       </w:r>
     </w:p>
     <w:p>
@@ -978,16 +728,7 @@
         <w:ind w:left="720" w:hanging="360"/>
       </w:pPr>
       <w:r>
-        <w:rPr>
-          <w:color w:val="1F3864"/>
-        </w:rPr>
-        <w:t xml:space="preserve">•  </w:t>
-      </w:r>
-      <w:r>
-        <w:rPr>
-          <w:color w:val="2E2E2E"/>
-        </w:rPr>
-        <w:t>Individual exam timetable slots — students are directed to the official timetable</w:t>
+        <w:t>•  Individual exam timetable slots — students are directed to the official timetable</w:t>
       </w:r>
     </w:p>
     <w:p>
@@ -997,16 +738,12 @@
     </w:p>
     <w:p>
       <w:pPr>
-        <w:pBdr>
-          <w:bottom w:val="single" w:sz="6" w:space="0" w:color="1F3864"/>
-        </w:pBdr>
         <w:spacing w:before="400" w:after="120"/>
       </w:pPr>
       <w:r>
         <w:rPr>
           <w:b/>
           <w:bCs/>
-          <w:color w:val="1F3864"/>
           <w:sz w:val="32"/>
           <w:szCs w:val="32"/>
         </w:rPr>
@@ -1036,12 +773,6 @@
         <w:gridCol w:w="3260"/>
       </w:tblGrid>
       <w:tr>
-        <w:tblPrEx>
-          <w:tblCellMar>
-            <w:top w:w="0" w:type="dxa"/>
-            <w:bottom w:w="0" w:type="dxa"/>
-          </w:tblCellMar>
-        </w:tblPrEx>
         <w:trPr>
           <w:tblHeader/>
         </w:trPr>
@@ -1067,7 +798,6 @@
               <w:rPr>
                 <w:b/>
                 <w:bCs/>
-                <w:color w:val="FFFFFF"/>
                 <w:sz w:val="20"/>
                 <w:szCs w:val="20"/>
               </w:rPr>
@@ -1097,7 +827,6 @@
               <w:rPr>
                 <w:b/>
                 <w:bCs/>
-                <w:color w:val="FFFFFF"/>
                 <w:sz w:val="20"/>
                 <w:szCs w:val="20"/>
               </w:rPr>
@@ -1127,7 +856,6 @@
               <w:rPr>
                 <w:b/>
                 <w:bCs/>
-                <w:color w:val="FFFFFF"/>
                 <w:sz w:val="20"/>
                 <w:szCs w:val="20"/>
               </w:rPr>
@@ -1137,12 +865,6 @@
         </w:tc>
       </w:tr>
       <w:tr>
-        <w:tblPrEx>
-          <w:tblCellMar>
-            <w:top w:w="0" w:type="dxa"/>
-            <w:bottom w:w="0" w:type="dxa"/>
-          </w:tblCellMar>
-        </w:tblPrEx>
         <w:tc>
           <w:tcPr>
             <w:tcW w:w="1600" w:type="dxa"/>
@@ -1163,7 +885,6 @@
           <w:p>
             <w:r>
               <w:rPr>
-                <w:color w:val="2E2E2E"/>
                 <w:sz w:val="20"/>
                 <w:szCs w:val="20"/>
               </w:rPr>
@@ -1191,7 +912,6 @@
           <w:p>
             <w:r>
               <w:rPr>
-                <w:color w:val="2E2E2E"/>
                 <w:sz w:val="20"/>
                 <w:szCs w:val="20"/>
               </w:rPr>
@@ -1219,7 +939,6 @@
           <w:p>
             <w:r>
               <w:rPr>
-                <w:color w:val="2E2E2E"/>
                 <w:sz w:val="20"/>
                 <w:szCs w:val="20"/>
               </w:rPr>
@@ -1229,12 +948,6 @@
         </w:tc>
       </w:tr>
       <w:tr>
-        <w:tblPrEx>
-          <w:tblCellMar>
-            <w:top w:w="0" w:type="dxa"/>
-            <w:bottom w:w="0" w:type="dxa"/>
-          </w:tblCellMar>
-        </w:tblPrEx>
         <w:tc>
           <w:tcPr>
             <w:tcW w:w="1600" w:type="dxa"/>
@@ -1255,7 +968,6 @@
           <w:p>
             <w:r>
               <w:rPr>
-                <w:color w:val="2E2E2E"/>
                 <w:sz w:val="20"/>
                 <w:szCs w:val="20"/>
               </w:rPr>
@@ -1283,7 +995,6 @@
           <w:p>
             <w:r>
               <w:rPr>
-                <w:color w:val="2E2E2E"/>
                 <w:sz w:val="20"/>
                 <w:szCs w:val="20"/>
               </w:rPr>
@@ -1311,7 +1022,6 @@
           <w:p>
             <w:r>
               <w:rPr>
-                <w:color w:val="2E2E2E"/>
                 <w:sz w:val="20"/>
                 <w:szCs w:val="20"/>
               </w:rPr>
@@ -1321,12 +1031,6 @@
         </w:tc>
       </w:tr>
       <w:tr>
-        <w:tblPrEx>
-          <w:tblCellMar>
-            <w:top w:w="0" w:type="dxa"/>
-            <w:bottom w:w="0" w:type="dxa"/>
-          </w:tblCellMar>
-        </w:tblPrEx>
         <w:tc>
           <w:tcPr>
             <w:tcW w:w="1600" w:type="dxa"/>
@@ -1347,7 +1051,6 @@
           <w:p>
             <w:r>
               <w:rPr>
-                <w:color w:val="2E2E2E"/>
                 <w:sz w:val="20"/>
                 <w:szCs w:val="20"/>
               </w:rPr>
@@ -1375,7 +1078,6 @@
           <w:p>
             <w:r>
               <w:rPr>
-                <w:color w:val="2E2E2E"/>
                 <w:sz w:val="20"/>
                 <w:szCs w:val="20"/>
               </w:rPr>
@@ -1403,7 +1105,6 @@
           <w:p>
             <w:r>
               <w:rPr>
-                <w:color w:val="2E2E2E"/>
                 <w:sz w:val="20"/>
                 <w:szCs w:val="20"/>
               </w:rPr>
@@ -1413,12 +1114,6 @@
         </w:tc>
       </w:tr>
       <w:tr>
-        <w:tblPrEx>
-          <w:tblCellMar>
-            <w:top w:w="0" w:type="dxa"/>
-            <w:bottom w:w="0" w:type="dxa"/>
-          </w:tblCellMar>
-        </w:tblPrEx>
         <w:tc>
           <w:tcPr>
             <w:tcW w:w="1600" w:type="dxa"/>
@@ -1439,7 +1134,6 @@
           <w:p>
             <w:r>
               <w:rPr>
-                <w:color w:val="2E2E2E"/>
                 <w:sz w:val="20"/>
                 <w:szCs w:val="20"/>
               </w:rPr>
@@ -1467,7 +1161,6 @@
           <w:p>
             <w:r>
               <w:rPr>
-                <w:color w:val="2E2E2E"/>
                 <w:sz w:val="20"/>
                 <w:szCs w:val="20"/>
               </w:rPr>
@@ -1495,7 +1188,6 @@
           <w:p>
             <w:r>
               <w:rPr>
-                <w:color w:val="2E2E2E"/>
                 <w:sz w:val="20"/>
                 <w:szCs w:val="20"/>
               </w:rPr>
@@ -1505,12 +1197,6 @@
         </w:tc>
       </w:tr>
       <w:tr>
-        <w:tblPrEx>
-          <w:tblCellMar>
-            <w:top w:w="0" w:type="dxa"/>
-            <w:bottom w:w="0" w:type="dxa"/>
-          </w:tblCellMar>
-        </w:tblPrEx>
         <w:tc>
           <w:tcPr>
             <w:tcW w:w="1600" w:type="dxa"/>
@@ -1531,7 +1217,6 @@
           <w:p>
             <w:r>
               <w:rPr>
-                <w:color w:val="2E2E2E"/>
                 <w:sz w:val="20"/>
                 <w:szCs w:val="20"/>
               </w:rPr>
@@ -1559,7 +1244,6 @@
           <w:p>
             <w:r>
               <w:rPr>
-                <w:color w:val="2E2E2E"/>
                 <w:sz w:val="20"/>
                 <w:szCs w:val="20"/>
               </w:rPr>
@@ -1587,7 +1271,6 @@
           <w:p>
             <w:r>
               <w:rPr>
-                <w:color w:val="2E2E2E"/>
                 <w:sz w:val="20"/>
                 <w:szCs w:val="20"/>
               </w:rPr>
@@ -1597,12 +1280,6 @@
         </w:tc>
       </w:tr>
       <w:tr>
-        <w:tblPrEx>
-          <w:tblCellMar>
-            <w:top w:w="0" w:type="dxa"/>
-            <w:bottom w:w="0" w:type="dxa"/>
-          </w:tblCellMar>
-        </w:tblPrEx>
         <w:tc>
           <w:tcPr>
             <w:tcW w:w="1600" w:type="dxa"/>
@@ -1623,7 +1300,6 @@
           <w:p>
             <w:r>
               <w:rPr>
-                <w:color w:val="2E2E2E"/>
                 <w:sz w:val="20"/>
                 <w:szCs w:val="20"/>
               </w:rPr>
@@ -1651,7 +1327,6 @@
           <w:p>
             <w:r>
               <w:rPr>
-                <w:color w:val="2E2E2E"/>
                 <w:sz w:val="20"/>
                 <w:szCs w:val="20"/>
               </w:rPr>
@@ -1679,7 +1354,6 @@
           <w:p>
             <w:r>
               <w:rPr>
-                <w:color w:val="2E2E2E"/>
                 <w:sz w:val="20"/>
                 <w:szCs w:val="20"/>
               </w:rPr>
@@ -1689,12 +1363,6 @@
         </w:tc>
       </w:tr>
       <w:tr>
-        <w:tblPrEx>
-          <w:tblCellMar>
-            <w:top w:w="0" w:type="dxa"/>
-            <w:bottom w:w="0" w:type="dxa"/>
-          </w:tblCellMar>
-        </w:tblPrEx>
         <w:tc>
           <w:tcPr>
             <w:tcW w:w="1600" w:type="dxa"/>
@@ -1715,7 +1383,6 @@
           <w:p>
             <w:r>
               <w:rPr>
-                <w:color w:val="2E2E2E"/>
                 <w:sz w:val="20"/>
                 <w:szCs w:val="20"/>
               </w:rPr>
@@ -1743,7 +1410,6 @@
           <w:p>
             <w:r>
               <w:rPr>
-                <w:color w:val="2E2E2E"/>
                 <w:sz w:val="20"/>
                 <w:szCs w:val="20"/>
               </w:rPr>
@@ -1771,7 +1437,6 @@
           <w:p>
             <w:r>
               <w:rPr>
-                <w:color w:val="2E2E2E"/>
                 <w:sz w:val="20"/>
                 <w:szCs w:val="20"/>
               </w:rPr>
@@ -1781,12 +1446,6 @@
         </w:tc>
       </w:tr>
       <w:tr>
-        <w:tblPrEx>
-          <w:tblCellMar>
-            <w:top w:w="0" w:type="dxa"/>
-            <w:bottom w:w="0" w:type="dxa"/>
-          </w:tblCellMar>
-        </w:tblPrEx>
         <w:tc>
           <w:tcPr>
             <w:tcW w:w="1600" w:type="dxa"/>
@@ -1807,7 +1466,6 @@
           <w:p>
             <w:r>
               <w:rPr>
-                <w:color w:val="2E2E2E"/>
                 <w:sz w:val="20"/>
                 <w:szCs w:val="20"/>
               </w:rPr>
@@ -1835,7 +1493,6 @@
           <w:p>
             <w:r>
               <w:rPr>
-                <w:color w:val="2E2E2E"/>
                 <w:sz w:val="20"/>
                 <w:szCs w:val="20"/>
               </w:rPr>
@@ -1863,7 +1520,6 @@
           <w:p>
             <w:r>
               <w:rPr>
-                <w:color w:val="2E2E2E"/>
                 <w:sz w:val="20"/>
                 <w:szCs w:val="20"/>
               </w:rPr>
@@ -1883,9 +1539,6 @@
         <w:spacing w:after="160"/>
       </w:pPr>
       <w:r>
-        <w:rPr>
-          <w:color w:val="2E2E2E"/>
-        </w:rPr>
         <w:t>All documents are fictional and created specifically for this project. They do not represent any real university or module.</w:t>
       </w:r>
     </w:p>
@@ -1896,16 +1549,12 @@
     </w:p>
     <w:p>
       <w:pPr>
-        <w:pBdr>
-          <w:top w:val="single" w:sz="4" w:space="0" w:color="CCCCCC"/>
-        </w:pBdr>
         <w:spacing w:before="400"/>
       </w:pPr>
       <w:r>
         <w:rPr>
           <w:i/>
           <w:iCs/>
-          <w:color w:val="595959"/>
           <w:sz w:val="18"/>
           <w:szCs w:val="18"/>
         </w:rPr>
@@ -1916,7 +1565,6 @@
         <w:rPr>
           <w:i/>
           <w:iCs/>
-          <w:color w:val="595959"/>
           <w:sz w:val="18"/>
           <w:szCs w:val="18"/>
         </w:rPr>
@@ -1927,7 +1575,6 @@
         <w:rPr>
           <w:i/>
           <w:iCs/>
-          <w:color w:val="595959"/>
           <w:sz w:val="18"/>
           <w:szCs w:val="18"/>
         </w:rPr>

</xml_diff>